<commit_message>
Update script to match final slides
</commit_message>
<xml_diff>
--- a/script/Presenation Slides - Script.docx
+++ b/script/Presenation Slides - Script.docx
@@ -380,22 +380,151 @@
     </w:p>
     <w:p>
       <w:pPr>
-        <w:rPr/>
-      </w:pPr>
-      <w:r>
-        <w:rPr>
-          <w:rtl w:val="0"/>
-        </w:rPr>
-      </w:r>
-    </w:p>
-    <w:p>
-      <w:pPr>
-        <w:rPr/>
-      </w:pPr>
-      <w:r>
-        <w:rPr>
-          <w:rtl w:val="0"/>
-        </w:rPr>
+        <w:spacing w:after="280" w:before="280" w:line="240" w:lineRule="auto"/>
+        <w:rPr>
+          <w:rFonts w:ascii="Times New Roman" w:cs="Times New Roman" w:eastAsia="Times New Roman" w:hAnsi="Times New Roman"/>
+        </w:rPr>
+      </w:pPr>
+      <w:r>
+        <w:rPr>
+          <w:rFonts w:ascii="Times New Roman" w:cs="Times New Roman" w:eastAsia="Times New Roman" w:hAnsi="Times New Roman"/>
+          <w:b w:val="1"/>
+          <w:bCs w:val="1"/>
+          <w:rtl w:val="0"/>
+        </w:rPr>
+        <w:t xml:space="preserve">Slide: Where is Rust Being Used?</w:t>
+      </w:r>
+      <w:r>
+        <w:rPr>
+          <w:rtl w:val="0"/>
+        </w:rPr>
+      </w:r>
+    </w:p>
+    <w:p>
+      <w:pPr>
+        <w:spacing w:after="220" w:line="276" w:lineRule="auto"/>
+        <w:rPr>
+          <w:rFonts w:ascii="Times New Roman" w:cs="Times New Roman" w:eastAsia="Times New Roman" w:hAnsi="Times New Roman"/>
+        </w:rPr>
+      </w:pPr>
+      <w:r>
+        <w:rPr>
+          <w:rFonts w:ascii="Times New Roman" w:cs="Times New Roman" w:eastAsia="Times New Roman" w:hAnsi="Times New Roman"/>
+          <w:rtl w:val="0"/>
+        </w:rPr>
+        <w:t xml:space="preserve">Now let's talk about how Rust is being used in the real world.</w:t>
+      </w:r>
+    </w:p>
+    <w:p>
+      <w:pPr>
+        <w:spacing w:after="220" w:line="276" w:lineRule="auto"/>
+        <w:rPr>
+          <w:rFonts w:ascii="Times New Roman" w:cs="Times New Roman" w:eastAsia="Times New Roman" w:hAnsi="Times New Roman"/>
+        </w:rPr>
+      </w:pPr>
+      <w:r>
+        <w:rPr>
+          <w:rFonts w:ascii="Times New Roman" w:cs="Times New Roman" w:eastAsia="Times New Roman" w:hAnsi="Times New Roman"/>
+          <w:rtl w:val="0"/>
+        </w:rPr>
+        <w:t xml:space="preserve">Many big companies are using Rust because it is fast and helps prevent memory-related security problems.</w:t>
+      </w:r>
+    </w:p>
+    <w:p>
+      <w:pPr>
+        <w:spacing w:after="220" w:line="276" w:lineRule="auto"/>
+        <w:rPr>
+          <w:rFonts w:ascii="Times New Roman" w:cs="Times New Roman" w:eastAsia="Times New Roman" w:hAnsi="Times New Roman"/>
+        </w:rPr>
+      </w:pPr>
+      <w:r>
+        <w:rPr>
+          <w:rFonts w:ascii="Times New Roman" w:cs="Times New Roman" w:eastAsia="Times New Roman" w:hAnsi="Times New Roman"/>
+          <w:rtl w:val="0"/>
+        </w:rPr>
+        <w:t xml:space="preserve">For example, Linux supports Rust for developing some parts of its kernel. Google also uses Rust in Android to improve security, and Microsoft has been exploring Rust for safer software development.</w:t>
+      </w:r>
+    </w:p>
+    <w:p>
+      <w:pPr>
+        <w:spacing w:after="280" w:before="280" w:line="240" w:lineRule="auto"/>
+        <w:rPr>
+          <w:rFonts w:ascii="Times New Roman" w:cs="Times New Roman" w:eastAsia="Times New Roman" w:hAnsi="Times New Roman"/>
+        </w:rPr>
+      </w:pPr>
+      <w:r>
+        <w:rPr>
+          <w:rFonts w:ascii="Times New Roman" w:cs="Times New Roman" w:eastAsia="Times New Roman" w:hAnsi="Times New Roman"/>
+          <w:b w:val="1"/>
+          <w:bCs w:val="1"/>
+          <w:rtl w:val="0"/>
+        </w:rPr>
+        <w:t xml:space="preserve">Slide: Challenges and Final Thoughts </w:t>
+      </w:r>
+      <w:r>
+        <w:rPr>
+          <w:rtl w:val="0"/>
+        </w:rPr>
+      </w:r>
+    </w:p>
+    <w:p>
+      <w:pPr>
+        <w:spacing w:after="220" w:line="276" w:lineRule="auto"/>
+        <w:rPr>
+          <w:rFonts w:ascii="Times New Roman" w:cs="Times New Roman" w:eastAsia="Times New Roman" w:hAnsi="Times New Roman"/>
+        </w:rPr>
+      </w:pPr>
+      <w:r>
+        <w:rPr>
+          <w:rFonts w:ascii="Times New Roman" w:cs="Times New Roman" w:eastAsia="Times New Roman" w:hAnsi="Times New Roman"/>
+          <w:rtl w:val="0"/>
+        </w:rPr>
+        <w:t xml:space="preserve">However, Rust also has some challenges. It can be difficult for beginners, especially when learning ownership and borrowing.</w:t>
+      </w:r>
+    </w:p>
+    <w:p>
+      <w:pPr>
+        <w:spacing w:after="220" w:line="276" w:lineRule="auto"/>
+        <w:rPr>
+          <w:rFonts w:ascii="Times New Roman" w:cs="Times New Roman" w:eastAsia="Times New Roman" w:hAnsi="Times New Roman"/>
+        </w:rPr>
+      </w:pPr>
+      <w:r>
+        <w:rPr>
+          <w:rFonts w:ascii="Times New Roman" w:cs="Times New Roman" w:eastAsia="Times New Roman" w:hAnsi="Times New Roman"/>
+          <w:rtl w:val="0"/>
+        </w:rPr>
+        <w:t xml:space="preserve">Even with these challenges, Rust is becoming more popular.</w:t>
+      </w:r>
+    </w:p>
+    <w:p>
+      <w:pPr>
+        <w:spacing w:after="220" w:line="276" w:lineRule="auto"/>
+        <w:rPr>
+          <w:rFonts w:ascii="Times New Roman" w:cs="Times New Roman" w:eastAsia="Times New Roman" w:hAnsi="Times New Roman"/>
+        </w:rPr>
+      </w:pPr>
+      <w:r>
+        <w:rPr>
+          <w:rFonts w:ascii="Times New Roman" w:cs="Times New Roman" w:eastAsia="Times New Roman" w:hAnsi="Times New Roman"/>
+          <w:rtl w:val="0"/>
+        </w:rPr>
+        <w:t xml:space="preserve">To conclude, Rust is a useful programming language because it combines speed with memory safety. I think learning Rust can be helpful for us as future programmers.</w:t>
+      </w:r>
+    </w:p>
+    <w:p>
+      <w:pPr>
+        <w:spacing w:after="220" w:line="276" w:lineRule="auto"/>
+        <w:rPr>
+          <w:rFonts w:ascii="Times New Roman" w:cs="Times New Roman" w:eastAsia="Times New Roman" w:hAnsi="Times New Roman"/>
+        </w:rPr>
+      </w:pPr>
+      <w:r>
+        <w:rPr>
+          <w:rFonts w:ascii="Times New Roman" w:cs="Times New Roman" w:eastAsia="Times New Roman" w:hAnsi="Times New Roman"/>
+          <w:rtl w:val="0"/>
+        </w:rPr>
+        <w:t xml:space="preserve">Thank you.</w:t>
       </w:r>
     </w:p>
     <w:p>

</xml_diff>